<commit_message>
Updated date on checkpoint 6+7
</commit_message>
<xml_diff>
--- a/Checkpoints/Checkpoint #6&7 (INFO-3111, Summer 2026).docx
+++ b/Checkpoints/Checkpoint #6&7 (INFO-3111, Summer 2026).docx
@@ -119,14 +119,7 @@
                 <w:b/>
                 <w:bCs/>
               </w:rPr>
-              <w:t>1</w:t>
-            </w:r>
-            <w:r>
-              <w:rPr>
-                <w:b/>
-                <w:bCs/>
-              </w:rPr>
-              <w:t>2</w:t>
+              <w:t>7</w:t>
             </w:r>
             <w:r>
               <w:rPr>
@@ -140,7 +133,7 @@
                 <w:b/>
                 <w:bCs/>
               </w:rPr>
-              <w:t>PM (noon)</w:t>
+              <w:t>PM</w:t>
             </w:r>
             <w:r>
               <w:rPr>
@@ -154,7 +147,21 @@
                 <w:b/>
                 <w:bCs/>
               </w:rPr>
-              <w:t>Wednesday, July 1</w:t>
+              <w:t>Wednesday</w:t>
+            </w:r>
+            <w:r>
+              <w:rPr>
+                <w:b/>
+                <w:bCs/>
+              </w:rPr>
+              <w:t>,</w:t>
+            </w:r>
+            <w:r>
+              <w:rPr>
+                <w:b/>
+                <w:bCs/>
+              </w:rPr>
+              <w:t xml:space="preserve"> June 29</w:t>
             </w:r>
             <w:r>
               <w:rPr>
@@ -162,21 +169,14 @@
                 <w:bCs/>
                 <w:vertAlign w:val="superscript"/>
               </w:rPr>
-              <w:t>st</w:t>
+              <w:t>th</w:t>
             </w:r>
             <w:r>
               <w:rPr>
                 <w:b/>
                 <w:bCs/>
               </w:rPr>
-              <w:t>,</w:t>
-            </w:r>
-            <w:r>
-              <w:rPr>
-                <w:b/>
-                <w:bCs/>
-              </w:rPr>
-              <w:t xml:space="preserve"> </w:t>
+              <w:t xml:space="preserve">, </w:t>
             </w:r>
             <w:r>
               <w:rPr>

</xml_diff>